<commit_message>
Separa módulos YANG de capacidades de protocolo e torna o demo robusto a frio
A lista de capacidades anunciada por um elemento NETCONF mistura os módulos
YANG que ele suporta com as capacidades do próprio protocolo (candidate,
validate, xpath e afins). O inventário tratava tudo como módulo YANG, o que
inflava a contagem e enchia os chips com URNs de protocolo truncadas.

Agora as duas classes são separadas na leitura do controlador: os elementos
anunciam 33 (O-DU) e 84 (O-RU) módulos YANG, mais 13 capacidades de protocolo
cada — antes reportados como 46 e 97. Relatório, apresentação e scripts foram
corrigidos com os números certos.

Também ajustados após um teste de subida a frio com volumes removidos:

- demo.sh espera ativamente o Non-RT RIC sincronizar o tipo de política com o
  RIC, em vez de um sleep fixo que não bastava numa pilha recém-criada;
- mensagem final de up.sh não menciona mais o NETCONF Call Home, que esta
  implantação não usa.
</commit_message>
<xml_diff>
--- a/docs/Relatorio_Parte2_SMO_OpenRAN.docx
+++ b/docs/Relatorio_Parte2_SMO_OpenRAN.docx
@@ -1942,13 +1942,44 @@
         <w:tblLook w:firstColumn="1" w:firstRow="1" w:lastColumn="0" w:lastRow="0" w:noHBand="0" w:noVBand="1" w:val="04A0"/>
       </w:tblPr>
       <w:tblGrid>
-        <w:gridCol w:w="3213"/>
-        <w:gridCol w:w="3213"/>
-        <w:gridCol w:w="3213"/>
+        <w:gridCol w:w="2409"/>
+        <w:gridCol w:w="2409"/>
+        <w:gridCol w:w="2409"/>
+        <w:gridCol w:w="2409"/>
       </w:tblGrid>
       <w:tr>
         <w:tc>
           <w:tcPr>
+            <w:tcW w:type="dxa" w:w="2016"/>
+          </w:tcPr>
+          <w:p>
+            <w:r/>
+            <w:r>
+              <w:rPr>
+                <w:b/>
+                <w:sz w:val="19"/>
+              </w:rPr>
+              <w:t>Elemento</w:t>
+            </w:r>
+          </w:p>
+        </w:tc>
+        <w:tc>
+          <w:tcPr>
+            <w:tcW w:type="dxa" w:w="2448"/>
+          </w:tcPr>
+          <w:p>
+            <w:r/>
+            <w:r>
+              <w:rPr>
+                <w:b/>
+                <w:sz w:val="19"/>
+              </w:rPr>
+              <w:t>Estado da conexão</w:t>
+            </w:r>
+          </w:p>
+        </w:tc>
+        <w:tc>
+          <w:tcPr>
             <w:tcW w:type="dxa" w:w="2304"/>
           </w:tcPr>
           <w:p>
@@ -1958,13 +1989,13 @@
                 <w:b/>
                 <w:sz w:val="19"/>
               </w:rPr>
-              <w:t>Elemento</w:t>
-            </w:r>
-          </w:p>
-        </w:tc>
-        <w:tc>
-          <w:tcPr>
-            <w:tcW w:type="dxa" w:w="2880"/>
+              <w:t>Módulos YANG</w:t>
+            </w:r>
+          </w:p>
+        </w:tc>
+        <w:tc>
+          <w:tcPr>
+            <w:tcW w:type="dxa" w:w="2736"/>
           </w:tcPr>
           <w:p>
             <w:r/>
@@ -1973,27 +2004,40 @@
                 <w:b/>
                 <w:sz w:val="19"/>
               </w:rPr>
-              <w:t>Estado da conexão</w:t>
-            </w:r>
-          </w:p>
-        </w:tc>
-        <w:tc>
-          <w:tcPr>
-            <w:tcW w:type="dxa" w:w="3456"/>
-          </w:tcPr>
-          <w:p>
-            <w:r/>
-            <w:r>
-              <w:rPr>
-                <w:b/>
-                <w:sz w:val="19"/>
-              </w:rPr>
-              <w:t>Módulos YANG anunciados</w:t>
-            </w:r>
-          </w:p>
-        </w:tc>
-      </w:tr>
-      <w:tr>
+              <w:t>Capacidades de protocolo</w:t>
+            </w:r>
+          </w:p>
+        </w:tc>
+      </w:tr>
+      <w:tr>
+        <w:tc>
+          <w:tcPr>
+            <w:tcW w:type="dxa" w:w="2016"/>
+          </w:tcPr>
+          <w:p>
+            <w:r/>
+            <w:r>
+              <w:rPr>
+                <w:sz w:val="19"/>
+              </w:rPr>
+              <w:t>o-du-1</w:t>
+            </w:r>
+          </w:p>
+        </w:tc>
+        <w:tc>
+          <w:tcPr>
+            <w:tcW w:type="dxa" w:w="2448"/>
+          </w:tcPr>
+          <w:p>
+            <w:r/>
+            <w:r>
+              <w:rPr>
+                <w:sz w:val="19"/>
+              </w:rPr>
+              <w:t>connected</w:t>
+            </w:r>
+          </w:p>
+        </w:tc>
         <w:tc>
           <w:tcPr>
             <w:tcW w:type="dxa" w:w="2304"/>
@@ -2004,13 +2048,43 @@
               <w:rPr>
                 <w:sz w:val="19"/>
               </w:rPr>
-              <w:t>o-du-1</w:t>
-            </w:r>
-          </w:p>
-        </w:tc>
-        <w:tc>
-          <w:tcPr>
-            <w:tcW w:type="dxa" w:w="2880"/>
+              <w:t>33</w:t>
+            </w:r>
+          </w:p>
+        </w:tc>
+        <w:tc>
+          <w:tcPr>
+            <w:tcW w:type="dxa" w:w="2736"/>
+          </w:tcPr>
+          <w:p>
+            <w:r/>
+            <w:r>
+              <w:rPr>
+                <w:sz w:val="19"/>
+              </w:rPr>
+              <w:t>13</w:t>
+            </w:r>
+          </w:p>
+        </w:tc>
+      </w:tr>
+      <w:tr>
+        <w:tc>
+          <w:tcPr>
+            <w:tcW w:type="dxa" w:w="2016"/>
+          </w:tcPr>
+          <w:p>
+            <w:r/>
+            <w:r>
+              <w:rPr>
+                <w:sz w:val="19"/>
+              </w:rPr>
+              <w:t>o-ru-1</w:t>
+            </w:r>
+          </w:p>
+        </w:tc>
+        <w:tc>
+          <w:tcPr>
+            <w:tcW w:type="dxa" w:w="2448"/>
           </w:tcPr>
           <w:p>
             <w:r/>
@@ -2024,22 +2098,6 @@
         </w:tc>
         <w:tc>
           <w:tcPr>
-            <w:tcW w:type="dxa" w:w="3456"/>
-          </w:tcPr>
-          <w:p>
-            <w:r/>
-            <w:r>
-              <w:rPr>
-                <w:sz w:val="19"/>
-              </w:rPr>
-              <w:t>46</w:t>
-            </w:r>
-          </w:p>
-        </w:tc>
-      </w:tr>
-      <w:tr>
-        <w:tc>
-          <w:tcPr>
             <w:tcW w:type="dxa" w:w="2304"/>
           </w:tcPr>
           <w:p>
@@ -2048,13 +2106,43 @@
               <w:rPr>
                 <w:sz w:val="19"/>
               </w:rPr>
-              <w:t>o-ru-1</w:t>
-            </w:r>
-          </w:p>
-        </w:tc>
-        <w:tc>
-          <w:tcPr>
-            <w:tcW w:type="dxa" w:w="2880"/>
+              <w:t>84</w:t>
+            </w:r>
+          </w:p>
+        </w:tc>
+        <w:tc>
+          <w:tcPr>
+            <w:tcW w:type="dxa" w:w="2736"/>
+          </w:tcPr>
+          <w:p>
+            <w:r/>
+            <w:r>
+              <w:rPr>
+                <w:sz w:val="19"/>
+              </w:rPr>
+              <w:t>13</w:t>
+            </w:r>
+          </w:p>
+        </w:tc>
+      </w:tr>
+      <w:tr>
+        <w:tc>
+          <w:tcPr>
+            <w:tcW w:type="dxa" w:w="2016"/>
+          </w:tcPr>
+          <w:p>
+            <w:r/>
+            <w:r>
+              <w:rPr>
+                <w:sz w:val="19"/>
+              </w:rPr>
+              <w:t>o-ru-2</w:t>
+            </w:r>
+          </w:p>
+        </w:tc>
+        <w:tc>
+          <w:tcPr>
+            <w:tcW w:type="dxa" w:w="2448"/>
           </w:tcPr>
           <w:p>
             <w:r/>
@@ -2068,22 +2156,6 @@
         </w:tc>
         <w:tc>
           <w:tcPr>
-            <w:tcW w:type="dxa" w:w="3456"/>
-          </w:tcPr>
-          <w:p>
-            <w:r/>
-            <w:r>
-              <w:rPr>
-                <w:sz w:val="19"/>
-              </w:rPr>
-              <w:t>97</w:t>
-            </w:r>
-          </w:p>
-        </w:tc>
-      </w:tr>
-      <w:tr>
-        <w:tc>
-          <w:tcPr>
             <w:tcW w:type="dxa" w:w="2304"/>
           </w:tcPr>
           <w:p>
@@ -2092,35 +2164,21 @@
               <w:rPr>
                 <w:sz w:val="19"/>
               </w:rPr>
-              <w:t>o-ru-2</w:t>
-            </w:r>
-          </w:p>
-        </w:tc>
-        <w:tc>
-          <w:tcPr>
-            <w:tcW w:type="dxa" w:w="2880"/>
-          </w:tcPr>
-          <w:p>
-            <w:r/>
-            <w:r>
-              <w:rPr>
-                <w:sz w:val="19"/>
-              </w:rPr>
-              <w:t>connected</w:t>
-            </w:r>
-          </w:p>
-        </w:tc>
-        <w:tc>
-          <w:tcPr>
-            <w:tcW w:type="dxa" w:w="3456"/>
-          </w:tcPr>
-          <w:p>
-            <w:r/>
-            <w:r>
-              <w:rPr>
-                <w:sz w:val="19"/>
-              </w:rPr>
-              <w:t>97</w:t>
+              <w:t>84</w:t>
+            </w:r>
+          </w:p>
+        </w:tc>
+        <w:tc>
+          <w:tcPr>
+            <w:tcW w:type="dxa" w:w="2736"/>
+          </w:tcPr>
+          <w:p>
+            <w:r/>
+            <w:r>
+              <w:rPr>
+                <w:sz w:val="19"/>
+              </w:rPr>
+              <w:t>13</w:t>
             </w:r>
           </w:p>
         </w:tc>
@@ -2133,7 +2191,16 @@
           <w:b w:val="0"/>
           <w:i w:val="0"/>
         </w:rPr>
-        <w:t>A contagem de módulos é a evidência direta do mecanismo de descoberta de capacidade da interface O1: o controlador lê, na negociação NETCONF, tudo o que o elemento declara suportar, e essa lista passa a determinar quais caminhos de configuração são válidos para aquele elemento. A diferença entre 46 e 97 módulos reflete a diferença real entre o modelo de uma unidade distribuída e o de um rádio de fronthaul.</w:t>
+        <w:t>A lista anunciada mistura duas coisas, e vale separá-las: os módulos YANG que o elemento suporta e as capacidades do próprio protocolo NETCONF — candidate, validate, xpath e afins —, iguais em todos os elementos. São os módulos YANG que determinam quais caminhos de configuração são válidos para aquele elemento, e a diferença entre 33 e 84 reflete a diferença real entre o modelo de uma unidade distribuída e o de um rádio de fronthaul.</w:t>
+      </w:r>
+    </w:p>
+    <w:p>
+      <w:r>
+        <w:rPr>
+          <w:b w:val="0"/>
+          <w:i w:val="0"/>
+        </w:rPr>
+        <w:t>Essa contagem é a evidência direta do mecanismo de descoberta de capacidade da interface O1: o controlador lê, na negociação NETCONF, tudo o que o elemento declara suportar, sem que o operador precise informar nada sobre o equipamento.</w:t>
       </w:r>
     </w:p>
     <w:p>
@@ -2602,7 +2669,7 @@
               <w:rPr>
                 <w:sz w:val="19"/>
               </w:rPr>
-              <w:t>&lt;get-config&gt;` no datastore running</w:t>
+              <w:t>get-config no datastore running</w:t>
             </w:r>
           </w:p>
         </w:tc>
@@ -2633,7 +2700,7 @@
               <w:rPr>
                 <w:sz w:val="19"/>
               </w:rPr>
-              <w:t>&lt;get&gt;` no datastore operational</w:t>
+              <w:t>get no datastore operational</w:t>
             </w:r>
           </w:p>
         </w:tc>
@@ -2664,7 +2731,7 @@
               <w:rPr>
                 <w:sz w:val="19"/>
               </w:rPr>
-              <w:t>&lt;edit-config&gt;` com substituição do ramo</w:t>
+              <w:t>edit-config com substituição do ramo</w:t>
             </w:r>
           </w:p>
         </w:tc>
@@ -2695,7 +2762,7 @@
               <w:rPr>
                 <w:sz w:val="19"/>
               </w:rPr>
-              <w:t>&lt;edit-config&gt;` com operação de remoção</w:t>
+              <w:t>edit-config com operação de remoção</w:t>
             </w:r>
           </w:p>
         </w:tc>
@@ -3336,7 +3403,7 @@
       <w:r>
         <w:drawing>
           <wp:inline>
-            <wp:extent cx="5760720" cy="12473559"/>
+            <wp:extent cx="5760720" cy="10953369"/>
             <wp:docPr id="3" name="Picture 3"/>
             <wp:cNvGraphicFramePr>
               <a:graphicFrameLocks noChangeAspect="1"/>
@@ -3357,7 +3424,7 @@
                   <pic:spPr>
                     <a:xfrm>
                       <a:off x="0" y="0"/>
-                      <a:ext cx="5760720" cy="12473559"/>
+                      <a:ext cx="5760720" cy="10953369"/>
                     </a:xfrm>
                     <a:prstGeom prst="rect"/>
                   </pic:spPr>
@@ -4269,7 +4336,7 @@
               <w:rPr>
                 <w:sz w:val="19"/>
               </w:rPr>
-              <w:t>3 elementos montados, com 46 e 97 módulos YANG</w:t>
+              <w:t>3 elementos montados, com 33 e 84 módulos YANG</w:t>
             </w:r>
           </w:p>
         </w:tc>

</xml_diff>

<commit_message>
Alinha documentação e capturas ao comportamento corrigido do portal
A Ajuda embutida e o relatório ainda descreviam a lista fixa de caminhos
sugeridos e diziam que um atalho inválido retornava 404. Passam a descrever a
sondagem no elemento e seus três estados, e a distinguir HTTP 400 (módulo não
anunciado) de 409 (ramo sem dado gravado).

Acrescenta ao diagnóstico dois casos observados em uso: código antigo servido
do cache do navegador, e a recusa do simulador em redefinir um tipo de política
que já tenha instâncias.

O relatório ganha a seção 12.1 sobre a suíte de testes, incluindo os dois
defeitos que ela revelou e por que passaram despercebidos numa inspeção visual
— a tela mostrava uma lista vazia, indistinguível de um estado legítimo sem
dados. Capturas e slides regenerados a partir da execução atual.
</commit_message>
<xml_diff>
--- a/docs/Relatorio_Parte2_SMO_OpenRAN.docx
+++ b/docs/Relatorio_Parte2_SMO_OpenRAN.docx
@@ -2534,7 +2534,7 @@
       <w:r>
         <w:drawing>
           <wp:inline>
-            <wp:extent cx="5760720" cy="5748718"/>
+            <wp:extent cx="5760720" cy="5848731"/>
             <wp:docPr id="1" name="Picture 1"/>
             <wp:cNvGraphicFramePr>
               <a:graphicFrameLocks noChangeAspect="1"/>
@@ -2555,7 +2555,7 @@
                   <pic:spPr>
                     <a:xfrm>
                       <a:off x="0" y="0"/>
-                      <a:ext cx="5760720" cy="5748718"/>
+                      <a:ext cx="5760720" cy="5848731"/>
                     </a:xfrm>
                     <a:prstGeom prst="rect"/>
                   </pic:spPr>
@@ -3403,7 +3403,7 @@
       <w:r>
         <w:drawing>
           <wp:inline>
-            <wp:extent cx="5760720" cy="10953369"/>
+            <wp:extent cx="5760720" cy="12473559"/>
             <wp:docPr id="3" name="Picture 3"/>
             <wp:cNvGraphicFramePr>
               <a:graphicFrameLocks noChangeAspect="1"/>
@@ -3424,7 +3424,7 @@
                   <pic:spPr>
                     <a:xfrm>
                       <a:off x="0" y="0"/>
-                      <a:ext cx="5760720" cy="10953369"/>
+                      <a:ext cx="5760720" cy="12473559"/>
                     </a:xfrm>
                     <a:prstGeom prst="rect"/>
                   </pic:spPr>
@@ -3555,7 +3555,7 @@
       <w:r>
         <w:drawing>
           <wp:inline>
-            <wp:extent cx="5760720" cy="4672584"/>
+            <wp:extent cx="5760720" cy="4332542"/>
             <wp:docPr id="4" name="Picture 4"/>
             <wp:cNvGraphicFramePr>
               <a:graphicFrameLocks noChangeAspect="1"/>
@@ -3576,7 +3576,7 @@
                   <pic:spPr>
                     <a:xfrm>
                       <a:off x="0" y="0"/>
-                      <a:ext cx="5760720" cy="4672584"/>
+                      <a:ext cx="5760720" cy="4332542"/>
                     </a:xfrm>
                     <a:prstGeom prst="rect"/>
                   </pic:spPr>
@@ -4682,6 +4682,45 @@
         <w:t>Treze passos concluídos, nenhuma falha. Os números observados em cerca de uma hora de operação contínua: 10 eventos de registro de PNF, 271 heartbeats, 174 eventos de falha e 31 relatórios de medição de desempenho.</w:t>
       </w:r>
     </w:p>
+    <w:p>
+      <w:pPr>
+        <w:pStyle w:val="Heading2"/>
+      </w:pPr>
+      <w:r>
+        <w:rPr>
+          <w:b w:val="0"/>
+          <w:i w:val="0"/>
+        </w:rPr>
+        <w:t>12.1 Suíte de testes do portal</w:t>
+      </w:r>
+    </w:p>
+    <w:p>
+      <w:r>
+        <w:rPr>
+          <w:b w:val="0"/>
+          <w:i w:val="0"/>
+        </w:rPr>
+        <w:t>Além do roteiro de demonstração, o repositório traz uma suíte de 87 testes automatizados sobre o portal: 60 sobre a API e 27 sobre a interface, estes últimos executados num navegador real. Nenhum deles usa simulação de dependência — cada caso percorre o caminho completo até o componente oficial correspondente, de modo que uma falha indica divergência real entre o portal e a pilha, e não um dublê desatualizado.</w:t>
+      </w:r>
+    </w:p>
+    <w:p>
+      <w:r>
+        <w:rPr>
+          <w:b w:val="0"/>
+          <w:i w:val="0"/>
+        </w:rPr>
+        <w:t>A suíte encontrou dois defeitos que o uso manual não havia revelado. O mais relevante: a tela de políticas nunca listou tipos nem instâncias, porque o cliente lia as chaves "policy_type_ids" e "policy_ids" enquanto o A1 Policy Management Service devolve "policytype_ids" e um arranjo "policies" com as instâncias completas. O segundo: a carga do tipo de política falhava com HTTP 400 quando o tipo já existia com instâncias associadas, porque o simulador recusa redefini-lo nessa situação.</w:t>
+      </w:r>
+    </w:p>
+    <w:p>
+      <w:r>
+        <w:rPr>
+          <w:b w:val="0"/>
+          <w:i w:val="0"/>
+        </w:rPr>
+        <w:t>O episódio é ilustrativo de um risco desta classe de integração. Ambos os defeitos estavam em nomes de campo e em condições de borda de APIs de terceiros — exatamente o tipo de erro que passa despercebido numa inspeção visual, porque a tela simplesmente mostra uma lista vazia, indistinguível de um estado legítimo sem dados.</w:t>
+      </w:r>
+    </w:p>
     <w:p/>
     <w:p>
       <w:pPr>
@@ -5473,7 +5512,7 @@
           <w:b w:val="0"/>
           <w:i w:val="0"/>
         </w:rPr>
-        <w:t xml:space="preserve"> — onde a configuração é efetivamente aplicada. Escolha o elemento, informe um caminho YANG ou use um dos atalhos, clique em Ler configuração, edite o JSON e clique em Aplicar configuração. A releitura exibida abaixo comprova que o elemento aplicou a mudança.</w:t>
+        <w:t xml:space="preserve"> — onde a configuração é efetivamente aplicada. Escolha o elemento, informe um caminho YANG ou use um dos atalhos, clique em Ler configuração, edite o JSON e clique em Aplicar configuração. A releitura exibida abaixo comprova que o elemento aplicou a mudança. Os atalhos são sondados no próprio elemento quando a tela abre e ordenados pelo resultado — em destaque os que têm configuração gravada, esmaecidos os ramos vazios, e mais claros ainda os módulos que o elemento não anuncia.</w:t>
       </w:r>
     </w:p>
     <w:p>
@@ -5924,7 +5963,67 @@
               <w:rPr>
                 <w:sz w:val="19"/>
               </w:rPr>
-              <w:t>O elemento anuncia o módulo YANG, mas não há dado gravado naquele ramo. É esperado em ramos nunca populados; os caminhos sugeridos no topo da tela sempre existem.</w:t>
+              <w:t>O elemento anuncia o módulo YANG, mas não há dado gravado naquele ramo. É esperado em ramos nunca populados, e a sondagem dos atalhos já sinaliza esse caso antes do clique. Um HTTP 400 indica módulo que o elemento não anuncia.</w:t>
+            </w:r>
+          </w:p>
+        </w:tc>
+      </w:tr>
+      <w:tr>
+        <w:tc>
+          <w:tcPr>
+            <w:tcW w:type="dxa" w:w="2736"/>
+          </w:tcPr>
+          <w:p>
+            <w:r/>
+            <w:r>
+              <w:rPr>
+                <w:sz w:val="19"/>
+              </w:rPr>
+              <w:t>O portal não reflete uma mudança recente no código</w:t>
+            </w:r>
+          </w:p>
+        </w:tc>
+        <w:tc>
+          <w:tcPr>
+            <w:tcW w:type="dxa" w:w="6336"/>
+          </w:tcPr>
+          <w:p>
+            <w:r/>
+            <w:r>
+              <w:rPr>
+                <w:sz w:val="19"/>
+              </w:rPr>
+              <w:t>Os módulos são servidos com revalidação obrigatória e o portal recarrega sozinho ao detectar um build novo. Se a tela ainda parecer antiga, force a recarga com Ctrl+Shift+R.</w:t>
+            </w:r>
+          </w:p>
+        </w:tc>
+      </w:tr>
+      <w:tr>
+        <w:tc>
+          <w:tcPr>
+            <w:tcW w:type="dxa" w:w="2736"/>
+          </w:tcPr>
+          <w:p>
+            <w:r/>
+            <w:r>
+              <w:rPr>
+                <w:sz w:val="19"/>
+              </w:rPr>
+              <w:t>Carregar o tipo de política devolve HTTP 400</w:t>
+            </w:r>
+          </w:p>
+        </w:tc>
+        <w:tc>
+          <w:tcPr>
+            <w:tcW w:type="dxa" w:w="6336"/>
+          </w:tcPr>
+          <w:p>
+            <w:r/>
+            <w:r>
+              <w:rPr>
+                <w:sz w:val="19"/>
+              </w:rPr>
+              <w:t>O simulador recusa redefinir um tipo que já tenha instâncias de política. O botão verifica antes de gravar e informa quando o tipo já está disponível; a recusa só aparece se houver instâncias a remover.</w:t>
             </w:r>
           </w:p>
         </w:tc>

</xml_diff>

<commit_message>
Renomeia o repositório para smo-openran
O sufixo "parte2" descrevia a etapa da disciplina, não o conteúdo: o
repositório contém a implantação do SMO e o portal de operação, que não são
específicos de uma entrega. Atualiza as instruções de clone no README e as
referências no relatório e na apresentação.
</commit_message>
<xml_diff>
--- a/docs/Relatorio_Parte2_SMO_OpenRAN.docx
+++ b/docs/Relatorio_Parte2_SMO_OpenRAN.docx
@@ -274,7 +274,7 @@
           <w:i w:val="0"/>
           <w:sz w:val="19"/>
         </w:rPr>
-        <w:t>github.com/felipefavilla/smo-openran-parte2</w:t>
+        <w:t>github.com/felipefavilla/smo-openran</w:t>
       </w:r>
       <w:r>
         <w:rPr>
@@ -5297,7 +5297,7 @@
           <w:rFonts w:ascii="Consolas" w:hAnsi="Consolas"/>
           <w:sz w:val="18"/>
         </w:rPr>
-        <w:t>git clone https://github.com/felipefavilla/smo-openran-parte2.git</w:t>
+        <w:t>git clone https://github.com/felipefavilla/smo-openran.git</w:t>
         <w:br/>
       </w:r>
       <w:r>
@@ -5305,7 +5305,7 @@
           <w:rFonts w:ascii="Consolas" w:hAnsi="Consolas"/>
           <w:sz w:val="18"/>
         </w:rPr>
-        <w:t>cd smo-openran-parte2/deploy</w:t>
+        <w:t>cd smo-openran/deploy</w:t>
         <w:br/>
       </w:r>
       <w:r>

</xml_diff>

<commit_message>
Ajusta relatório, apresentação e README conforme revisão
Relatório e apresentação:

- Removidas as referências ao repositório. A seção de instalação passa a
  assumir o diretório do projeto, começando em "cd deploy".
- Removida a indicação de quem apresenta no rodapé dos slides, redundante com
  os integrantes já listados na capa.
- Removida das referências a Parte 1 deste mesmo grupo, por ser autocitação.
- Corpo de texto do relatório justificado; títulos, legendas, blocos de código
  e células de tabela mantêm o alinhamento próprio.
- Todas as capturas do portal passam a usar o tema claro, inclusive as das
  telas de ciclo de vida e visão geral, antes em tema escuro.

Em toda a documentação e nos comentários de código, o radical "implanta" foi
trocado por "implementa" — 37 ocorrências, cobrindo implantação, implantada e
implantado.
</commit_message>
<xml_diff>
--- a/docs/Relatorio_Parte2_SMO_OpenRAN.docx
+++ b/docs/Relatorio_Parte2_SMO_OpenRAN.docx
@@ -27,6 +27,9 @@
       </w:r>
     </w:p>
     <w:p>
+      <w:pPr>
+        <w:jc w:val="both"/>
+      </w:pPr>
       <w:r>
         <w:rPr>
           <w:b w:val="0"/>
@@ -36,6 +39,9 @@
       </w:r>
     </w:p>
     <w:p>
+      <w:pPr>
+        <w:jc w:val="both"/>
+      </w:pPr>
       <w:r>
         <w:rPr>
           <w:b w:val="0"/>
@@ -45,6 +51,9 @@
       </w:r>
     </w:p>
     <w:p>
+      <w:pPr>
+        <w:jc w:val="both"/>
+      </w:pPr>
       <w:r>
         <w:rPr>
           <w:b w:val="0"/>
@@ -53,7 +62,11 @@
         <w:t>Setembro de 2026</w:t>
       </w:r>
     </w:p>
-    <w:p/>
+    <w:p>
+      <w:pPr>
+        <w:jc w:val="both"/>
+      </w:pPr>
+    </w:p>
     <w:p>
       <w:pPr>
         <w:pStyle w:val="Heading1"/>
@@ -67,6 +80,9 @@
       </w:r>
     </w:p>
     <w:p>
+      <w:pPr>
+        <w:jc w:val="both"/>
+      </w:pPr>
       <w:r>
         <w:rPr>
           <w:b w:val="0"/>
@@ -76,6 +92,9 @@
       </w:r>
     </w:p>
     <w:p>
+      <w:pPr>
+        <w:jc w:val="both"/>
+      </w:pPr>
       <w:r>
         <w:rPr>
           <w:b w:val="0"/>
@@ -85,15 +104,21 @@
       </w:r>
     </w:p>
     <w:p>
-      <w:r>
-        <w:rPr>
-          <w:b w:val="0"/>
-          <w:i w:val="0"/>
-        </w:rPr>
-        <w:t>3. Arquitetura implantada</w:t>
-      </w:r>
-    </w:p>
-    <w:p>
+      <w:pPr>
+        <w:jc w:val="both"/>
+      </w:pPr>
+      <w:r>
+        <w:rPr>
+          <w:b w:val="0"/>
+          <w:i w:val="0"/>
+        </w:rPr>
+        <w:t>3. Arquitetura implementada</w:t>
+      </w:r>
+    </w:p>
+    <w:p>
+      <w:pPr>
+        <w:jc w:val="both"/>
+      </w:pPr>
       <w:r>
         <w:rPr>
           <w:b w:val="0"/>
@@ -103,6 +128,9 @@
       </w:r>
     </w:p>
     <w:p>
+      <w:pPr>
+        <w:jc w:val="both"/>
+      </w:pPr>
       <w:r>
         <w:rPr>
           <w:b w:val="0"/>
@@ -112,6 +140,9 @@
       </w:r>
     </w:p>
     <w:p>
+      <w:pPr>
+        <w:jc w:val="both"/>
+      </w:pPr>
       <w:r>
         <w:rPr>
           <w:b w:val="0"/>
@@ -121,6 +152,9 @@
       </w:r>
     </w:p>
     <w:p>
+      <w:pPr>
+        <w:jc w:val="both"/>
+      </w:pPr>
       <w:r>
         <w:rPr>
           <w:b w:val="0"/>
@@ -130,6 +164,9 @@
       </w:r>
     </w:p>
     <w:p>
+      <w:pPr>
+        <w:jc w:val="both"/>
+      </w:pPr>
       <w:r>
         <w:rPr>
           <w:b w:val="0"/>
@@ -139,6 +176,9 @@
       </w:r>
     </w:p>
     <w:p>
+      <w:pPr>
+        <w:jc w:val="both"/>
+      </w:pPr>
       <w:r>
         <w:rPr>
           <w:b w:val="0"/>
@@ -148,6 +188,9 @@
       </w:r>
     </w:p>
     <w:p>
+      <w:pPr>
+        <w:jc w:val="both"/>
+      </w:pPr>
       <w:r>
         <w:rPr>
           <w:b w:val="0"/>
@@ -157,6 +200,9 @@
       </w:r>
     </w:p>
     <w:p>
+      <w:pPr>
+        <w:jc w:val="both"/>
+      </w:pPr>
       <w:r>
         <w:rPr>
           <w:b w:val="0"/>
@@ -166,6 +212,9 @@
       </w:r>
     </w:p>
     <w:p>
+      <w:pPr>
+        <w:jc w:val="both"/>
+      </w:pPr>
       <w:r>
         <w:rPr>
           <w:b w:val="0"/>
@@ -175,6 +224,9 @@
       </w:r>
     </w:p>
     <w:p>
+      <w:pPr>
+        <w:jc w:val="both"/>
+      </w:pPr>
       <w:r>
         <w:rPr>
           <w:b w:val="0"/>
@@ -184,6 +236,9 @@
       </w:r>
     </w:p>
     <w:p>
+      <w:pPr>
+        <w:jc w:val="both"/>
+      </w:pPr>
       <w:r>
         <w:rPr>
           <w:b w:val="0"/>
@@ -193,6 +248,9 @@
       </w:r>
     </w:p>
     <w:p>
+      <w:pPr>
+        <w:jc w:val="both"/>
+      </w:pPr>
       <w:r>
         <w:rPr>
           <w:b w:val="0"/>
@@ -202,6 +260,9 @@
       </w:r>
     </w:p>
     <w:p>
+      <w:pPr>
+        <w:jc w:val="both"/>
+      </w:pPr>
       <w:r>
         <w:rPr>
           <w:b w:val="0"/>
@@ -211,6 +272,9 @@
       </w:r>
     </w:p>
     <w:p>
+      <w:pPr>
+        <w:jc w:val="both"/>
+      </w:pPr>
       <w:r>
         <w:rPr>
           <w:b w:val="0"/>
@@ -219,7 +283,11 @@
         <w:t>17. Referências</w:t>
       </w:r>
     </w:p>
-    <w:p/>
+    <w:p>
+      <w:pPr>
+        <w:jc w:val="both"/>
+      </w:pPr>
+    </w:p>
     <w:p>
       <w:pPr>
         <w:pStyle w:val="Heading1"/>
@@ -233,6 +301,9 @@
       </w:r>
     </w:p>
     <w:p>
+      <w:pPr>
+        <w:jc w:val="both"/>
+      </w:pPr>
       <w:r>
         <w:rPr>
           <w:b w:val="0"/>
@@ -242,6 +313,9 @@
       </w:r>
     </w:p>
     <w:p>
+      <w:pPr>
+        <w:jc w:val="both"/>
+      </w:pPr>
       <w:r>
         <w:rPr>
           <w:b w:val="0"/>
@@ -251,6 +325,9 @@
       </w:r>
     </w:p>
     <w:p>
+      <w:pPr>
+        <w:jc w:val="both"/>
+      </w:pPr>
       <w:r>
         <w:rPr>
           <w:b w:val="0"/>
@@ -260,31 +337,22 @@
       </w:r>
     </w:p>
     <w:p>
-      <w:r>
-        <w:rPr>
-          <w:b w:val="0"/>
-          <w:i w:val="0"/>
-        </w:rPr>
-        <w:t xml:space="preserve">Todo o material produzido está publicado em </w:t>
-      </w:r>
-      <w:r>
-        <w:rPr>
-          <w:rFonts w:ascii="Consolas" w:hAnsi="Consolas"/>
-          <w:b w:val="0"/>
-          <w:i w:val="0"/>
-          <w:sz w:val="19"/>
-        </w:rPr>
-        <w:t>github.com/felipefavilla/smo-openran</w:t>
-      </w:r>
-      <w:r>
-        <w:rPr>
-          <w:b w:val="0"/>
-          <w:i w:val="0"/>
-        </w:rPr>
-        <w:t>, com a pilha completa, o portal de operação, os scripts de verificação e este relatório.</w:t>
-      </w:r>
-    </w:p>
-    <w:p/>
+      <w:pPr>
+        <w:jc w:val="both"/>
+      </w:pPr>
+      <w:r>
+        <w:rPr>
+          <w:b w:val="0"/>
+          <w:i w:val="0"/>
+        </w:rPr>
+        <w:t>O material produzido reúne a pilha completa, o portal de operação, os scripts de verificação e este relatório.</w:t>
+      </w:r>
+    </w:p>
+    <w:p>
+      <w:pPr>
+        <w:jc w:val="both"/>
+      </w:pPr>
+    </w:p>
     <w:p>
       <w:pPr>
         <w:pStyle w:val="Heading1"/>
@@ -306,16 +374,19 @@
           <w:b w:val="0"/>
           <w:i w:val="0"/>
         </w:rPr>
-        <w:t>2.1 O que foi implantado</w:t>
-      </w:r>
-    </w:p>
-    <w:p>
-      <w:r>
-        <w:rPr>
-          <w:b w:val="0"/>
-          <w:i w:val="0"/>
-        </w:rPr>
-        <w:t>A implantação reúne dez imagens de contêiner, todas artefatos oficiais publicados pela O-RAN Software Community e pelo ONAP, nas versões fixadas pela M-Release do projeto OAM (dezembro de 2025), mais um componente escrito por este grupo — um portal de operação. A distinção importa e é mantida em todo o relatório: tudo que executa funções de SMO é software oficial; o portal apenas consome as APIs desses componentes e as apresenta.</w:t>
+        <w:t>2.1 O que foi implementado</w:t>
+      </w:r>
+    </w:p>
+    <w:p>
+      <w:pPr>
+        <w:jc w:val="both"/>
+      </w:pPr>
+      <w:r>
+        <w:rPr>
+          <w:b w:val="0"/>
+          <w:i w:val="0"/>
+        </w:rPr>
+        <w:t>A implementação reúne dez imagens de contêiner, todas artefatos oficiais publicados pela O-RAN Software Community e pelo ONAP, nas versões fixadas pela M-Release do projeto OAM (dezembro de 2025), mais um componente escrito por este grupo — um portal de operação. A distinção importa e é mantida em todo o relatório: tudo que executa funções de SMO é software oficial; o portal apenas consome as APIs desses componentes e as apresenta.</w:t>
       </w:r>
     </w:p>
     <w:tbl>
@@ -996,15 +1067,21 @@
       </w:r>
     </w:p>
     <w:p>
-      <w:r>
-        <w:rPr>
-          <w:b w:val="0"/>
-          <w:i w:val="0"/>
-        </w:rPr>
-        <w:t>A implantação seguiu quatro etapas, cada uma validada antes da seguinte: infraestrutura (persistência e barramento de mensagens); núcleo OAM (coletor VES e controlador SDN-R); rede gerenciada (os três simuladores de funções de rede); e Non-RT RIC (serviço de políticas e simulador de Near-RT RIC). Cada etapa só foi considerada concluída com evidência de funcionamento — não a subida do contêiner, mas a resposta correta da API correspondente.</w:t>
-      </w:r>
-    </w:p>
-    <w:p>
+      <w:pPr>
+        <w:jc w:val="both"/>
+      </w:pPr>
+      <w:r>
+        <w:rPr>
+          <w:b w:val="0"/>
+          <w:i w:val="0"/>
+        </w:rPr>
+        <w:t>A implementação seguiu quatro etapas, cada uma validada antes da seguinte: infraestrutura (persistência e barramento de mensagens); núcleo OAM (coletor VES e controlador SDN-R); rede gerenciada (os três simuladores de funções de rede); e Non-RT RIC (serviço de políticas e simulador de Near-RT RIC). Cada etapa só foi considerada concluída com evidência de funcionamento — não a subida do contêiner, mas a resposta correta da API correspondente.</w:t>
+      </w:r>
+    </w:p>
+    <w:p>
+      <w:pPr>
+        <w:jc w:val="both"/>
+      </w:pPr>
       <w:r>
         <w:rPr>
           <w:b w:val="0"/>
@@ -1026,6 +1103,9 @@
       </w:r>
     </w:p>
     <w:p>
+      <w:pPr>
+        <w:jc w:val="both"/>
+      </w:pPr>
       <w:r>
         <w:rPr>
           <w:b w:val="0"/>
@@ -1034,7 +1114,11 @@
         <w:t>Docker Desktop sobre Windows 11 com WSL2, 16 GB de memória física e 16 núcleos lógicos. A pilha completa consome cerca de 2,5 GB de memória em regime permanente, com o controlador OpenDaylight respondendo pela maior parte. O tempo de subida a frio é de aproximadamente cinco minutos, quase todo gasto no carregamento dos módulos Karaf do controlador.</w:t>
       </w:r>
     </w:p>
-    <w:p/>
+    <w:p>
+      <w:pPr>
+        <w:jc w:val="both"/>
+      </w:pPr>
+    </w:p>
     <w:p>
       <w:pPr>
         <w:pStyle w:val="Heading1"/>
@@ -1044,10 +1128,13 @@
           <w:b w:val="0"/>
           <w:i w:val="0"/>
         </w:rPr>
-        <w:t>3. Arquitetura implantada</w:t>
-      </w:r>
-    </w:p>
-    <w:p>
+        <w:t>3. Arquitetura implementada</w:t>
+      </w:r>
+    </w:p>
+    <w:p>
+      <w:pPr>
+        <w:jc w:val="both"/>
+      </w:pPr>
       <w:r>
         <w:rPr>
           <w:b w:val="0"/>
@@ -1230,16 +1317,23 @@
       </w:r>
     </w:p>
     <w:p>
+      <w:pPr>
+        <w:jc w:val="center"/>
+      </w:pPr>
       <w:r>
         <w:rPr>
           <w:b w:val="0"/>
           <w:i/>
           <w:sz w:val="18"/>
         </w:rPr>
-        <w:t>Figura 1 — Arquitetura da pilha implantada e os caminhos de dados entre seus componentes.</w:t>
-      </w:r>
-    </w:p>
-    <w:p/>
+        <w:t>Figura 1 — Arquitetura da pilha implementada e os caminhos de dados entre seus componentes.</w:t>
+      </w:r>
+    </w:p>
+    <w:p>
+      <w:pPr>
+        <w:jc w:val="both"/>
+      </w:pPr>
+    </w:p>
     <w:p>
       <w:pPr>
         <w:pStyle w:val="Heading2"/>
@@ -1253,6 +1347,9 @@
       </w:r>
     </w:p>
     <w:p>
+      <w:pPr>
+        <w:jc w:val="both"/>
+      </w:pPr>
       <w:r>
         <w:rPr>
           <w:b w:val="0"/>
@@ -1265,6 +1362,7 @@
       <w:pPr>
         <w:spacing w:after="80"/>
         <w:ind w:left="432" w:hanging="432"/>
+        <w:jc w:val="both"/>
       </w:pPr>
       <w:r>
         <w:t xml:space="preserve">1. </w:t>
@@ -1277,6 +1375,7 @@
       <w:pPr>
         <w:spacing w:after="80"/>
         <w:ind w:left="432" w:hanging="432"/>
+        <w:jc w:val="both"/>
       </w:pPr>
       <w:r>
         <w:t xml:space="preserve">2. </w:t>
@@ -1289,6 +1388,7 @@
       <w:pPr>
         <w:spacing w:after="80"/>
         <w:ind w:left="432" w:hanging="432"/>
+        <w:jc w:val="both"/>
       </w:pPr>
       <w:r>
         <w:t xml:space="preserve">3. </w:t>
@@ -1301,6 +1401,7 @@
       <w:pPr>
         <w:spacing w:after="80"/>
         <w:ind w:left="432" w:hanging="432"/>
+        <w:jc w:val="both"/>
       </w:pPr>
       <w:r>
         <w:t xml:space="preserve">4. </w:t>
@@ -1313,6 +1414,7 @@
       <w:pPr>
         <w:spacing w:after="80"/>
         <w:ind w:left="432" w:hanging="432"/>
+        <w:jc w:val="both"/>
       </w:pPr>
       <w:r>
         <w:t xml:space="preserve">5. </w:t>
@@ -1322,6 +1424,9 @@
       </w:r>
     </w:p>
     <w:p>
+      <w:pPr>
+        <w:jc w:val="both"/>
+      </w:pPr>
       <w:r>
         <w:rPr>
           <w:b w:val="0"/>
@@ -1330,7 +1435,11 @@
         <w:t>O ponto a destacar é que nenhuma dessas etapas exige intervenção manual ou conhecimento prévio do elemento por parte do operador: o SMO descobre, monta e configura. É esse encadeamento que a especificação da interface O1 chama de gerenciamento de configuração, e ele funciona na distribuição da OSC como descrito.</w:t>
       </w:r>
     </w:p>
-    <w:p/>
+    <w:p>
+      <w:pPr>
+        <w:jc w:val="both"/>
+      </w:pPr>
+    </w:p>
     <w:p>
       <w:pPr>
         <w:pStyle w:val="Heading1"/>
@@ -1356,6 +1465,9 @@
       </w:r>
     </w:p>
     <w:p>
+      <w:pPr>
+        <w:jc w:val="both"/>
+      </w:pPr>
       <w:r>
         <w:rPr>
           <w:b w:val="0"/>
@@ -1409,7 +1521,7 @@
           <w:b w:val="0"/>
           <w:i w:val="0"/>
         </w:rPr>
-        <w:t>. O único arquivo de configuração próprio é o que declara o Near-RT RIC desta implantação e os elementos que ele gerencia.</w:t>
+        <w:t>. O único arquivo de configuração próprio é o que declara o Near-RT RIC desta implementação e os elementos que ele gerencia.</w:t>
       </w:r>
     </w:p>
     <w:p>
@@ -1425,12 +1537,15 @@
       </w:r>
     </w:p>
     <w:p>
-      <w:r>
-        <w:rPr>
-          <w:b w:val="0"/>
-          <w:i w:val="0"/>
-        </w:rPr>
-        <w:t>A distribuição oficial sobe cerca de vinte contêineres. Os itens abaixo foram removidos por não pertencerem a nenhum ponto do objeto de estudo e por multiplicarem o custo de implantação sem contrapartida analítica. São decisões de escopo, registradas como tais:</w:t>
+      <w:pPr>
+        <w:jc w:val="both"/>
+      </w:pPr>
+      <w:r>
+        <w:rPr>
+          <w:b w:val="0"/>
+          <w:i w:val="0"/>
+        </w:rPr>
+        <w:t>A distribuição oficial sobe cerca de vinte contêineres. Os itens abaixo foram removidos por não pertencerem a nenhum ponto do objeto de estudo e por multiplicarem o custo de implementação sem contrapartida analítica. São decisões de escopo, registradas como tais:</w:t>
       </w:r>
     </w:p>
     <w:tbl>
@@ -1658,12 +1773,15 @@
     </w:tbl>
     <w:p/>
     <w:p>
-      <w:r>
-        <w:rPr>
-          <w:b w:val="0"/>
-          <w:i w:val="0"/>
-        </w:rPr>
-        <w:t>Na mensageria, o Kafka roda com listener PLAINTEXT simples, sem SASL nem autorizador OPA, porque não há multi-tenancy nem exposição externa nesta implantação.</w:t>
+      <w:pPr>
+        <w:jc w:val="both"/>
+      </w:pPr>
+      <w:r>
+        <w:rPr>
+          <w:b w:val="0"/>
+          <w:i w:val="0"/>
+        </w:rPr>
+        <w:t>Na mensageria, o Kafka roda com listener PLAINTEXT simples, sem SASL nem autorizador OPA, porque não há multi-tenancy nem exposição externa nesta implementação.</w:t>
       </w:r>
     </w:p>
     <w:p>
@@ -1679,6 +1797,9 @@
       </w:r>
     </w:p>
     <w:p>
+      <w:pPr>
+        <w:jc w:val="both"/>
+      </w:pPr>
       <w:r>
         <w:rPr>
           <w:b w:val="0"/>
@@ -1700,6 +1821,9 @@
       </w:r>
     </w:p>
     <w:p>
+      <w:pPr>
+        <w:jc w:val="both"/>
+      </w:pPr>
       <w:r>
         <w:rPr>
           <w:b w:val="0"/>
@@ -1753,6 +1877,9 @@
       </w:r>
     </w:p>
     <w:p>
+      <w:pPr>
+        <w:jc w:val="both"/>
+      </w:pPr>
       <w:r>
         <w:rPr>
           <w:b w:val="0"/>
@@ -1762,12 +1889,15 @@
       </w:r>
     </w:p>
     <w:p>
-      <w:r>
-        <w:rPr>
-          <w:b w:val="0"/>
-          <w:i w:val="0"/>
-        </w:rPr>
-        <w:t>A implantação usa apenas o registro por VES, que é o fluxo canônico documentado pela OSC e o mais interessante do ponto de vista do objeto de estudo, por exercitar a cadeia completa VES → Kafka → mountpoint-registrar → NETCONF. A capacidade de Call Home do controlador permanece habilitada e a porta correspondente exposta.</w:t>
+      <w:pPr>
+        <w:jc w:val="both"/>
+      </w:pPr>
+      <w:r>
+        <w:rPr>
+          <w:b w:val="0"/>
+          <w:i w:val="0"/>
+        </w:rPr>
+        <w:t>A implementação usa apenas o registro por VES, que é o fluxo canônico documentado pela OSC e o mais interessante do ponto de vista do objeto de estudo, por exercitar a cadeia completa VES → Kafka → mountpoint-registrar → NETCONF. A capacidade de Call Home do controlador permanece habilitada e a porta correspondente exposta.</w:t>
       </w:r>
     </w:p>
     <w:p>
@@ -1783,6 +1913,9 @@
       </w:r>
     </w:p>
     <w:p>
+      <w:pPr>
+        <w:jc w:val="both"/>
+      </w:pPr>
       <w:r>
         <w:rPr>
           <w:b w:val="0"/>
@@ -1836,6 +1969,9 @@
       </w:r>
     </w:p>
     <w:p>
+      <w:pPr>
+        <w:jc w:val="both"/>
+      </w:pPr>
       <w:r>
         <w:rPr>
           <w:b w:val="0"/>
@@ -1892,7 +2028,11 @@
         <w:t xml:space="preserve"> do bash.</w:t>
       </w:r>
     </w:p>
-    <w:p/>
+    <w:p>
+      <w:pPr>
+        <w:jc w:val="both"/>
+      </w:pPr>
+    </w:p>
     <w:p>
       <w:pPr>
         <w:pStyle w:val="Heading1"/>
@@ -1906,6 +2046,9 @@
       </w:r>
     </w:p>
     <w:p>
+      <w:pPr>
+        <w:jc w:val="both"/>
+      </w:pPr>
       <w:r>
         <w:rPr>
           <w:b w:val="0"/>
@@ -1927,6 +2070,9 @@
       </w:r>
     </w:p>
     <w:p>
+      <w:pPr>
+        <w:jc w:val="both"/>
+      </w:pPr>
       <w:r>
         <w:rPr>
           <w:b w:val="0"/>
@@ -2186,6 +2332,9 @@
     </w:tbl>
     <w:p/>
     <w:p>
+      <w:pPr>
+        <w:jc w:val="both"/>
+      </w:pPr>
       <w:r>
         <w:rPr>
           <w:b w:val="0"/>
@@ -2195,6 +2344,9 @@
       </w:r>
     </w:p>
     <w:p>
+      <w:pPr>
+        <w:jc w:val="both"/>
+      </w:pPr>
       <w:r>
         <w:rPr>
           <w:b w:val="0"/>
@@ -2216,6 +2368,9 @@
       </w:r>
     </w:p>
     <w:p>
+      <w:pPr>
+        <w:jc w:val="both"/>
+      </w:pPr>
       <w:r>
         <w:rPr>
           <w:b w:val="0"/>
@@ -2225,6 +2380,9 @@
       </w:r>
     </w:p>
     <w:p>
+      <w:pPr>
+        <w:jc w:val="both"/>
+      </w:pPr>
       <w:r>
         <w:rPr>
           <w:b w:val="0"/>
@@ -2519,6 +2677,9 @@
     </w:tbl>
     <w:p/>
     <w:p>
+      <w:pPr>
+        <w:jc w:val="both"/>
+      </w:pPr>
       <w:r>
         <w:rPr>
           <w:b w:val="0"/>
@@ -2579,7 +2740,11 @@
         <w:t>Figura 2 — Tela de provisionamento: perfil aplicado a cada elemento, com o código de resposta de cada etapa, e o editor de configuração por caminho YANG.</w:t>
       </w:r>
     </w:p>
-    <w:p/>
+    <w:p>
+      <w:pPr>
+        <w:jc w:val="both"/>
+      </w:pPr>
+    </w:p>
     <w:p>
       <w:pPr>
         <w:pStyle w:val="Heading1"/>
@@ -2593,6 +2758,9 @@
       </w:r>
     </w:p>
     <w:p>
+      <w:pPr>
+        <w:jc w:val="both"/>
+      </w:pPr>
       <w:r>
         <w:rPr>
           <w:b w:val="0"/>
@@ -2770,6 +2938,9 @@
     </w:tbl>
     <w:p/>
     <w:p>
+      <w:pPr>
+        <w:jc w:val="both"/>
+      </w:pPr>
       <w:r>
         <w:rPr>
           <w:b w:val="0"/>
@@ -2779,6 +2950,9 @@
       </w:r>
     </w:p>
     <w:p>
+      <w:pPr>
+        <w:jc w:val="both"/>
+      </w:pPr>
       <w:r>
         <w:rPr>
           <w:b w:val="0"/>
@@ -2791,6 +2965,7 @@
       <w:pPr>
         <w:spacing w:after="80"/>
         <w:ind w:left="432" w:hanging="432"/>
+        <w:jc w:val="both"/>
       </w:pPr>
       <w:r>
         <w:t xml:space="preserve">•  </w:t>
@@ -2803,6 +2978,7 @@
       <w:pPr>
         <w:spacing w:after="80"/>
         <w:ind w:left="432" w:hanging="432"/>
+        <w:jc w:val="both"/>
       </w:pPr>
       <w:r>
         <w:t xml:space="preserve">•  </w:t>
@@ -2811,7 +2987,11 @@
         <w:t>a leitura de um nó de alto nível pode podar listas de estado que só aparecem quando se lê o nó filho diretamente. Isso foi observado com a lista de medições suportadas de uma célula, e obrigou o reconciliador a ler célula a célula em vez de fazer uma leitura única.</w:t>
       </w:r>
     </w:p>
-    <w:p/>
+    <w:p>
+      <w:pPr>
+        <w:jc w:val="both"/>
+      </w:pPr>
+    </w:p>
     <w:p>
       <w:pPr>
         <w:pStyle w:val="Heading1"/>
@@ -2825,6 +3005,9 @@
       </w:r>
     </w:p>
     <w:p>
+      <w:pPr>
+        <w:jc w:val="both"/>
+      </w:pPr>
       <w:r>
         <w:rPr>
           <w:b w:val="0"/>
@@ -2834,12 +3017,15 @@
       </w:r>
     </w:p>
     <w:p>
-      <w:r>
-        <w:rPr>
-          <w:b w:val="0"/>
-          <w:i w:val="0"/>
-        </w:rPr>
-        <w:t>A separação por tópico não é cosmética: é o que permite que consumidores diferentes — o mountpoint-registrar, uma rApp de garantia de serviço, um portal de operação — recebam exatamente o que lhes interessa, sem filtrar o fluxo inteiro. Os oito tópicos criados pelo coletor nesta implantação:</w:t>
+      <w:pPr>
+        <w:jc w:val="both"/>
+      </w:pPr>
+      <w:r>
+        <w:rPr>
+          <w:b w:val="0"/>
+          <w:i w:val="0"/>
+        </w:rPr>
+        <w:t>A separação por tópico não é cosmética: é o que permite que consumidores diferentes — o mountpoint-registrar, uma rApp de garantia de serviço, um portal de operação — recebam exatamente o que lhes interessa, sem filtrar o fluxo inteiro. Os oito tópicos criados pelo coletor nesta implementação:</w:t>
       </w:r>
     </w:p>
     <w:tbl>
@@ -2895,7 +3081,7 @@
                 <w:b/>
                 <w:sz w:val="19"/>
               </w:rPr>
-              <w:t>Consumidor nesta implantação</w:t>
+              <w:t>Consumidor nesta implementação</w:t>
             </w:r>
           </w:p>
         </w:tc>
@@ -3263,6 +3449,9 @@
     </w:tbl>
     <w:p/>
     <w:p>
+      <w:pPr>
+        <w:jc w:val="both"/>
+      </w:pPr>
       <w:r>
         <w:rPr>
           <w:b w:val="0"/>
@@ -3271,7 +3460,11 @@
         <w:t>Uma observação relevante sobre a evolução da plataforma: a M-Release abandonou o DMaaP Message Router usado nas versões anteriores e passou a publicar diretamente no Kafka. Os arquivos de configuração do coletor ainda trazem URLs no formato antigo, mas apenas o nome do tópico é utilizado. Essa mudança tem consequência prática para quem escreve consumidores: o acesso passa a exigir um cliente Kafka, não mais chamadas REST.</w:t>
       </w:r>
     </w:p>
-    <w:p/>
+    <w:p>
+      <w:pPr>
+        <w:jc w:val="both"/>
+      </w:pPr>
+    </w:p>
     <w:p>
       <w:pPr>
         <w:pStyle w:val="Heading1"/>
@@ -3297,6 +3490,9 @@
       </w:r>
     </w:p>
     <w:p>
+      <w:pPr>
+        <w:jc w:val="both"/>
+      </w:pPr>
       <w:r>
         <w:rPr>
           <w:b w:val="0"/>
@@ -3306,6 +3502,9 @@
       </w:r>
     </w:p>
     <w:p>
+      <w:pPr>
+        <w:jc w:val="both"/>
+      </w:pPr>
       <w:r>
         <w:rPr>
           <w:b w:val="0"/>
@@ -3379,6 +3578,9 @@
       </w:r>
     </w:p>
     <w:p>
+      <w:pPr>
+        <w:jc w:val="both"/>
+      </w:pPr>
       <w:r>
         <w:rPr>
           <w:b w:val="0"/>
@@ -3388,6 +3590,9 @@
       </w:r>
     </w:p>
     <w:p>
+      <w:pPr>
+        <w:jc w:val="both"/>
+      </w:pPr>
       <w:r>
         <w:rPr>
           <w:b w:val="0"/>
@@ -3448,7 +3653,11 @@
         <w:t>Figura 4 — Tela de desempenho: vazão de eventos por domínio, distribuição por elemento e séries temporais dos indicadores coletados.</w:t>
       </w:r>
     </w:p>
-    <w:p/>
+    <w:p>
+      <w:pPr>
+        <w:jc w:val="both"/>
+      </w:pPr>
+    </w:p>
     <w:p>
       <w:pPr>
         <w:pStyle w:val="Heading1"/>
@@ -3462,15 +3671,21 @@
       </w:r>
     </w:p>
     <w:p>
-      <w:r>
-        <w:rPr>
-          <w:b w:val="0"/>
-          <w:i w:val="0"/>
-        </w:rPr>
-        <w:t>O Non-RT RIC foi implantado com dois componentes: o A1 Policy Management Service, que concentra a comunicação com os Near-RT RIC, e o simulador de Near-RT RIC mantido pela própria OSC, que implementa o lado sul da interface A1.</w:t>
-      </w:r>
-    </w:p>
-    <w:p>
+      <w:pPr>
+        <w:jc w:val="both"/>
+      </w:pPr>
+      <w:r>
+        <w:rPr>
+          <w:b w:val="0"/>
+          <w:i w:val="0"/>
+        </w:rPr>
+        <w:t>O Non-RT RIC foi implementado com dois componentes: o A1 Policy Management Service, que concentra a comunicação com os Near-RT RIC, e o simulador de Near-RT RIC mantido pela própria OSC, que implementa o lado sul da interface A1.</w:t>
+      </w:r>
+    </w:p>
+    <w:p>
+      <w:pPr>
+        <w:jc w:val="both"/>
+      </w:pPr>
       <w:r>
         <w:rPr>
           <w:b w:val="0"/>
@@ -3480,6 +3695,9 @@
       </w:r>
     </w:p>
     <w:p>
+      <w:pPr>
+        <w:jc w:val="both"/>
+      </w:pPr>
       <w:r>
         <w:rPr>
           <w:b w:val="0"/>
@@ -3492,6 +3710,7 @@
       <w:pPr>
         <w:spacing w:after="80"/>
         <w:ind w:left="432" w:hanging="432"/>
+        <w:jc w:val="both"/>
       </w:pPr>
       <w:r>
         <w:t xml:space="preserve">1. </w:t>
@@ -3504,6 +3723,7 @@
       <w:pPr>
         <w:spacing w:after="80"/>
         <w:ind w:left="432" w:hanging="432"/>
+        <w:jc w:val="both"/>
       </w:pPr>
       <w:r>
         <w:t xml:space="preserve">2. </w:t>
@@ -3516,6 +3736,7 @@
       <w:pPr>
         <w:spacing w:after="80"/>
         <w:ind w:left="432" w:hanging="432"/>
+        <w:jc w:val="both"/>
       </w:pPr>
       <w:r>
         <w:t xml:space="preserve">3. </w:t>
@@ -3528,6 +3749,7 @@
       <w:pPr>
         <w:spacing w:after="80"/>
         <w:ind w:left="432" w:hanging="432"/>
+        <w:jc w:val="both"/>
       </w:pPr>
       <w:r>
         <w:t xml:space="preserve">4. </w:t>
@@ -3540,6 +3762,7 @@
       <w:pPr>
         <w:spacing w:after="80"/>
         <w:ind w:left="432" w:hanging="432"/>
+        <w:jc w:val="both"/>
       </w:pPr>
       <w:r>
         <w:t xml:space="preserve">5. </w:t>
@@ -3600,7 +3823,11 @@
         <w:t>Figura 5 — Tela de políticas A1: RIC gerenciado, tipos disponíveis, formulário de criação e instâncias com o estado reportado pelo próprio RIC.</w:t>
       </w:r>
     </w:p>
-    <w:p/>
+    <w:p>
+      <w:pPr>
+        <w:jc w:val="both"/>
+      </w:pPr>
+    </w:p>
     <w:p>
       <w:pPr>
         <w:pStyle w:val="Heading1"/>
@@ -3614,6 +3841,9 @@
       </w:r>
     </w:p>
     <w:p>
+      <w:pPr>
+        <w:jc w:val="both"/>
+      </w:pPr>
       <w:r>
         <w:rPr>
           <w:b w:val="0"/>
@@ -3623,6 +3853,9 @@
       </w:r>
     </w:p>
     <w:p>
+      <w:pPr>
+        <w:jc w:val="both"/>
+      </w:pPr>
       <w:r>
         <w:rPr>
           <w:b w:val="0"/>
@@ -3632,6 +3865,9 @@
       </w:r>
     </w:p>
     <w:p>
+      <w:pPr>
+        <w:jc w:val="both"/>
+      </w:pPr>
       <w:r>
         <w:rPr>
           <w:b w:val="0"/>
@@ -3656,7 +3892,7 @@
               <a:graphicData uri="http://schemas.openxmlformats.org/drawingml/2006/picture">
                 <pic:pic>
                   <pic:nvPicPr>
-                    <pic:cNvPr id="0" name="ciclo-de-vida-dark.png"/>
+                    <pic:cNvPr id="0" name="ciclo-de-vida-light.png"/>
                     <pic:cNvPicPr/>
                   </pic:nvPicPr>
                   <pic:blipFill>
@@ -3692,7 +3928,11 @@
         <w:t>Figura 6 — Tela de ciclo de vida: estado de cada função de rede, estado do mountpoint O1 correspondente e ações de início, parada e reinício.</w:t>
       </w:r>
     </w:p>
-    <w:p/>
+    <w:p>
+      <w:pPr>
+        <w:jc w:val="both"/>
+      </w:pPr>
+    </w:p>
     <w:p>
       <w:pPr>
         <w:pStyle w:val="Heading1"/>
@@ -3706,6 +3946,9 @@
       </w:r>
     </w:p>
     <w:p>
+      <w:pPr>
+        <w:jc w:val="both"/>
+      </w:pPr>
       <w:r>
         <w:rPr>
           <w:b w:val="0"/>
@@ -4139,6 +4382,9 @@
       </w:r>
     </w:p>
     <w:p>
+      <w:pPr>
+        <w:jc w:val="both"/>
+      </w:pPr>
       <w:r>
         <w:rPr>
           <w:b w:val="0"/>
@@ -4148,6 +4394,9 @@
       </w:r>
     </w:p>
     <w:p>
+      <w:pPr>
+        <w:jc w:val="both"/>
+      </w:pPr>
       <w:r>
         <w:rPr>
           <w:b w:val="0"/>
@@ -4157,6 +4406,9 @@
       </w:r>
     </w:p>
     <w:p>
+      <w:pPr>
+        <w:jc w:val="both"/>
+      </w:pPr>
       <w:r>
         <w:rPr>
           <w:b w:val="0"/>
@@ -4181,7 +4433,7 @@
               <a:graphicData uri="http://schemas.openxmlformats.org/drawingml/2006/picture">
                 <pic:pic>
                   <pic:nvPicPr>
-                    <pic:cNvPr id="0" name="visao-geral-dark.png"/>
+                    <pic:cNvPr id="0" name="visao-geral-light.png"/>
                     <pic:cNvPicPr/>
                   </pic:nvPicPr>
                   <pic:blipFill>
@@ -4214,10 +4466,14 @@
           <w:color w:val="52514E"/>
           <w:sz w:val="18"/>
         </w:rPr>
-        <w:t>Figura 7 — Visão geral no tema escuro: indicadores, fluxo de eventos por domínio, topologia gerenciada e saúde dos componentes.</w:t>
-      </w:r>
-    </w:p>
-    <w:p/>
+        <w:t>Figura 7 — Visão geral: indicadores, fluxo de eventos por domínio, topologia gerenciada e saúde dos componentes da plataforma.</w:t>
+      </w:r>
+    </w:p>
+    <w:p>
+      <w:pPr>
+        <w:jc w:val="both"/>
+      </w:pPr>
+    </w:p>
     <w:p>
       <w:pPr>
         <w:pStyle w:val="Heading1"/>
@@ -4231,12 +4487,15 @@
       </w:r>
     </w:p>
     <w:p>
-      <w:r>
-        <w:rPr>
-          <w:b w:val="0"/>
-          <w:i w:val="0"/>
-        </w:rPr>
-        <w:t>O repositório inclui um roteiro de verificação executável que exercita os sete mecanismos pedidos pelo objeto de estudo e imprime o resultado de cada passo. Ele serve tanto como teste de regressão quanto como roteiro de demonstração. Resultado da última execução:</w:t>
+      <w:pPr>
+        <w:jc w:val="both"/>
+      </w:pPr>
+      <w:r>
+        <w:rPr>
+          <w:b w:val="0"/>
+          <w:i w:val="0"/>
+        </w:rPr>
+        <w:t>A entrega inclui um roteiro de verificação executável que exercita os sete mecanismos pedidos pelo objeto de estudo e imprime o resultado de cada passo. Ele serve tanto como teste de regressão quanto como roteiro de demonstração. Resultado da última execução:</w:t>
       </w:r>
     </w:p>
     <w:tbl>
@@ -4674,6 +4933,9 @@
     </w:tbl>
     <w:p/>
     <w:p>
+      <w:pPr>
+        <w:jc w:val="both"/>
+      </w:pPr>
       <w:r>
         <w:rPr>
           <w:b w:val="0"/>
@@ -4695,15 +4957,21 @@
       </w:r>
     </w:p>
     <w:p>
-      <w:r>
-        <w:rPr>
-          <w:b w:val="0"/>
-          <w:i w:val="0"/>
-        </w:rPr>
-        <w:t>Além do roteiro de demonstração, o repositório traz uma suíte de 87 testes automatizados sobre o portal: 60 sobre a API e 27 sobre a interface, estes últimos executados num navegador real. Nenhum deles usa simulação de dependência — cada caso percorre o caminho completo até o componente oficial correspondente, de modo que uma falha indica divergência real entre o portal e a pilha, e não um dublê desatualizado.</w:t>
-      </w:r>
-    </w:p>
-    <w:p>
+      <w:pPr>
+        <w:jc w:val="both"/>
+      </w:pPr>
+      <w:r>
+        <w:rPr>
+          <w:b w:val="0"/>
+          <w:i w:val="0"/>
+        </w:rPr>
+        <w:t>Além do roteiro de demonstração, a entrega traz uma suíte de 87 testes automatizados sobre o portal: 60 sobre a API e 27 sobre a interface, estes últimos executados num navegador real. Nenhum deles usa simulação de dependência — cada caso percorre o caminho completo até o componente oficial correspondente, de modo que uma falha indica divergência real entre o portal e a pilha, e não um dublê desatualizado.</w:t>
+      </w:r>
+    </w:p>
+    <w:p>
+      <w:pPr>
+        <w:jc w:val="both"/>
+      </w:pPr>
       <w:r>
         <w:rPr>
           <w:b w:val="0"/>
@@ -4713,6 +4981,9 @@
       </w:r>
     </w:p>
     <w:p>
+      <w:pPr>
+        <w:jc w:val="both"/>
+      </w:pPr>
       <w:r>
         <w:rPr>
           <w:b w:val="0"/>
@@ -4721,7 +4992,11 @@
         <w:t>O episódio é ilustrativo de um risco desta classe de integração. Ambos os defeitos estavam em nomes de campo e em condições de borda de APIs de terceiros — exatamente o tipo de erro que passa despercebido numa inspeção visual, porque a tela simplesmente mostra uma lista vazia, indistinguível de um estado legítimo sem dados.</w:t>
       </w:r>
     </w:p>
-    <w:p/>
+    <w:p>
+      <w:pPr>
+        <w:jc w:val="both"/>
+      </w:pPr>
+    </w:p>
     <w:p>
       <w:pPr>
         <w:pStyle w:val="Heading1"/>
@@ -4735,6 +5010,9 @@
       </w:r>
     </w:p>
     <w:p>
+      <w:pPr>
+        <w:jc w:val="both"/>
+      </w:pPr>
       <w:r>
         <w:rPr>
           <w:b w:val="0"/>
@@ -4884,7 +5162,7 @@
               <w:rPr>
                 <w:sz w:val="19"/>
               </w:rPr>
-              <w:t>confirmado no que toca a políticas A1. O ciclo completo de tipo, instância e entrega ao RIC funciona. O rApp Manager, porém, exige o perfil Kubernetes e ficou fora desta implantação.</w:t>
+              <w:t>confirmado no que toca a políticas A1. O ciclo completo de tipo, instância e entrega ao RIC funciona. O rApp Manager, porém, exige o perfil Kubernetes e ficou fora desta implementação.</w:t>
             </w:r>
           </w:p>
         </w:tc>
@@ -5112,15 +5390,21 @@
     </w:tbl>
     <w:p/>
     <w:p>
-      <w:r>
-        <w:rPr>
-          <w:b w:val="0"/>
-          <w:i w:val="0"/>
-        </w:rPr>
-        <w:t>A implementação não contradiz a análise da Parte 1, mas acrescenta uma nuance que a leitura da documentação não permitia antecipar: a distância entre "a plataforma implementa a função" e "a função está operacional após a instalação" é maior do que a documentação sugere. Três exemplos concretos surgiram nesta implantação — a telemetria que não flui até que o SMO a configure, o tipo de política que precisa ser carregado no RIC antes de qualquer instância, e o job de medição sem o qual não há KPI algum.</w:t>
-      </w:r>
-    </w:p>
-    <w:p>
+      <w:pPr>
+        <w:jc w:val="both"/>
+      </w:pPr>
+      <w:r>
+        <w:rPr>
+          <w:b w:val="0"/>
+          <w:i w:val="0"/>
+        </w:rPr>
+        <w:t>A implementação não contradiz a análise da Parte 1, mas acrescenta uma nuance que a leitura da documentação não permitia antecipar: a distância entre "a plataforma implementa a função" e "a função está operacional após a instalação" é maior do que a documentação sugere. Três exemplos concretos surgiram nesta implementação — a telemetria que não flui até que o SMO a configure, o tipo de política que precisa ser carregado no RIC antes de qualquer instância, e o job de medição sem o qual não há KPI algum.</w:t>
+      </w:r>
+    </w:p>
+    <w:p>
+      <w:pPr>
+        <w:jc w:val="both"/>
+      </w:pPr>
       <w:r>
         <w:rPr>
           <w:b w:val="0"/>
@@ -5129,7 +5413,11 @@
         <w:t>Essa distância não é um defeito da plataforma: é a natureza de um SMO. O que a OSC entrega são os mecanismos; a configuração que os coloca em operação é responsabilidade de quem opera a rede. O que a implementação mostra é que essa responsabilidade é maior do que a documentação deixa entrever, e que boa parte do trabalho de colocar um SMO em produção está justamente aí.</w:t>
       </w:r>
     </w:p>
-    <w:p/>
+    <w:p>
+      <w:pPr>
+        <w:jc w:val="both"/>
+      </w:pPr>
+    </w:p>
     <w:p>
       <w:pPr>
         <w:pStyle w:val="Heading1"/>
@@ -5158,6 +5446,7 @@
       <w:pPr>
         <w:spacing w:after="80"/>
         <w:ind w:left="432" w:hanging="432"/>
+        <w:jc w:val="both"/>
       </w:pPr>
       <w:r>
         <w:t xml:space="preserve">•  </w:t>
@@ -5170,6 +5459,7 @@
       <w:pPr>
         <w:spacing w:after="80"/>
         <w:ind w:left="432" w:hanging="432"/>
+        <w:jc w:val="both"/>
       </w:pPr>
       <w:r>
         <w:t xml:space="preserve">•  </w:t>
@@ -5182,6 +5472,7 @@
       <w:pPr>
         <w:spacing w:after="80"/>
         <w:ind w:left="432" w:hanging="432"/>
+        <w:jc w:val="both"/>
       </w:pPr>
       <w:r>
         <w:t xml:space="preserve">•  </w:t>
@@ -5194,6 +5485,7 @@
       <w:pPr>
         <w:spacing w:after="80"/>
         <w:ind w:left="432" w:hanging="432"/>
+        <w:jc w:val="both"/>
       </w:pPr>
       <w:r>
         <w:t xml:space="preserve">•  </w:t>
@@ -5203,6 +5495,9 @@
       </w:r>
     </w:p>
     <w:p>
+      <w:pPr>
+        <w:jc w:val="both"/>
+      </w:pPr>
       <w:r>
         <w:rPr>
           <w:b w:val="0"/>
@@ -5297,7 +5592,7 @@
           <w:rFonts w:ascii="Consolas" w:hAnsi="Consolas"/>
           <w:sz w:val="18"/>
         </w:rPr>
-        <w:t>git clone https://github.com/felipefavilla/smo-openran.git</w:t>
+        <w:t>cd deploy</w:t>
         <w:br/>
       </w:r>
       <w:r>
@@ -5305,7 +5600,6 @@
           <w:rFonts w:ascii="Consolas" w:hAnsi="Consolas"/>
           <w:sz w:val="18"/>
         </w:rPr>
-        <w:t>cd smo-openran/deploy</w:t>
         <w:br/>
       </w:r>
       <w:r>
@@ -5313,6 +5607,7 @@
           <w:rFonts w:ascii="Consolas" w:hAnsi="Consolas"/>
           <w:sz w:val="18"/>
         </w:rPr>
+        <w:t># núcleo O1 + pilha Open RAN simulada + portal</w:t>
         <w:br/>
       </w:r>
       <w:r>
@@ -5320,7 +5615,7 @@
           <w:rFonts w:ascii="Consolas" w:hAnsi="Consolas"/>
           <w:sz w:val="18"/>
         </w:rPr>
-        <w:t># núcleo O1 + pilha Open RAN simulada + portal</w:t>
+        <w:t>./scripts/up.sh</w:t>
         <w:br/>
       </w:r>
       <w:r>
@@ -5328,7 +5623,6 @@
           <w:rFonts w:ascii="Consolas" w:hAnsi="Consolas"/>
           <w:sz w:val="18"/>
         </w:rPr>
-        <w:t>./scripts/up.sh</w:t>
         <w:br/>
       </w:r>
       <w:r>
@@ -5336,6 +5630,7 @@
           <w:rFonts w:ascii="Consolas" w:hAnsi="Consolas"/>
           <w:sz w:val="18"/>
         </w:rPr>
+        <w:t># ou, incluindo o Non-RT RIC (interface A1)</w:t>
         <w:br/>
       </w:r>
       <w:r>
@@ -5343,33 +5638,47 @@
           <w:rFonts w:ascii="Consolas" w:hAnsi="Consolas"/>
           <w:sz w:val="18"/>
         </w:rPr>
-        <w:t># ou, incluindo o Non-RT RIC (interface A1)</w:t>
-        <w:br/>
+        <w:t>./scripts/up.sh --with-a1</w:t>
+      </w:r>
+    </w:p>
+    <w:p>
+      <w:pPr>
+        <w:jc w:val="both"/>
+      </w:pPr>
+      <w:r>
+        <w:rPr>
+          <w:b w:val="0"/>
+          <w:i w:val="0"/>
+        </w:rPr>
+        <w:t>O script constrói as duas imagens locais, sobe a pilha na ordem correta e aguarda cada camada ficar saudável, com indicação de progresso. A primeira execução baixa cerca de 5 GB de imagens. O controlador OpenDaylight leva de três a cinco minutos para ficar saudável na primeira subida — é o passo mais demorado, e é normal.</w:t>
+      </w:r>
+    </w:p>
+    <w:p>
+      <w:pPr>
+        <w:jc w:val="both"/>
+      </w:pPr>
+      <w:r>
+        <w:rPr>
+          <w:b w:val="0"/>
+          <w:i w:val="0"/>
+        </w:rPr>
+        <w:t xml:space="preserve">Para encerrar: </w:t>
       </w:r>
       <w:r>
         <w:rPr>
           <w:rFonts w:ascii="Consolas" w:hAnsi="Consolas"/>
-          <w:sz w:val="18"/>
-        </w:rPr>
-        <w:t>./scripts/up.sh --with-a1</w:t>
-      </w:r>
-    </w:p>
-    <w:p>
-      <w:r>
-        <w:rPr>
-          <w:b w:val="0"/>
-          <w:i w:val="0"/>
-        </w:rPr>
-        <w:t>O script constrói as duas imagens locais, sobe a pilha na ordem correta e aguarda cada camada ficar saudável, com indicação de progresso. A primeira execução baixa cerca de 5 GB de imagens. O controlador OpenDaylight leva de três a cinco minutos para ficar saudável na primeira subida — é o passo mais demorado, e é normal.</w:t>
-      </w:r>
-    </w:p>
-    <w:p>
-      <w:r>
-        <w:rPr>
-          <w:b w:val="0"/>
-          <w:i w:val="0"/>
-        </w:rPr>
-        <w:t xml:space="preserve">Para encerrar: </w:t>
+          <w:b w:val="0"/>
+          <w:i w:val="0"/>
+          <w:sz w:val="19"/>
+        </w:rPr>
+        <w:t>./scripts/down.sh</w:t>
+      </w:r>
+      <w:r>
+        <w:rPr>
+          <w:b w:val="0"/>
+          <w:i w:val="0"/>
+        </w:rPr>
+        <w:t xml:space="preserve"> preserva os volumes; </w:t>
       </w:r>
       <w:r>
         <w:rPr>
@@ -5378,22 +5687,6 @@
           <w:i w:val="0"/>
           <w:sz w:val="19"/>
         </w:rPr>
-        <w:t>./scripts/down.sh</w:t>
-      </w:r>
-      <w:r>
-        <w:rPr>
-          <w:b w:val="0"/>
-          <w:i w:val="0"/>
-        </w:rPr>
-        <w:t xml:space="preserve"> preserva os volumes; </w:t>
-      </w:r>
-      <w:r>
-        <w:rPr>
-          <w:rFonts w:ascii="Consolas" w:hAnsi="Consolas"/>
-          <w:b w:val="0"/>
-          <w:i w:val="0"/>
-          <w:sz w:val="19"/>
-        </w:rPr>
         <w:t>./scripts/down.sh --purge</w:t>
       </w:r>
       <w:r>
@@ -5417,6 +5710,9 @@
       </w:r>
     </w:p>
     <w:p>
+      <w:pPr>
+        <w:jc w:val="both"/>
+      </w:pPr>
       <w:r>
         <w:rPr>
           <w:b w:val="0"/>
@@ -5426,6 +5722,9 @@
       </w:r>
     </w:p>
     <w:p>
+      <w:pPr>
+        <w:jc w:val="both"/>
+      </w:pPr>
       <w:r>
         <w:rPr>
           <w:b w:val="0"/>
@@ -5450,6 +5749,7 @@
       <w:pPr>
         <w:spacing w:after="80"/>
         <w:ind w:left="432" w:hanging="432"/>
+        <w:jc w:val="both"/>
       </w:pPr>
       <w:r>
         <w:t xml:space="preserve">•  </w:t>
@@ -5473,6 +5773,7 @@
       <w:pPr>
         <w:spacing w:after="80"/>
         <w:ind w:left="432" w:hanging="432"/>
+        <w:jc w:val="both"/>
       </w:pPr>
       <w:r>
         <w:t xml:space="preserve">•  </w:t>
@@ -5496,6 +5797,7 @@
       <w:pPr>
         <w:spacing w:after="80"/>
         <w:ind w:left="432" w:hanging="432"/>
+        <w:jc w:val="both"/>
       </w:pPr>
       <w:r>
         <w:t xml:space="preserve">•  </w:t>
@@ -5519,6 +5821,7 @@
       <w:pPr>
         <w:spacing w:after="80"/>
         <w:ind w:left="432" w:hanging="432"/>
+        <w:jc w:val="both"/>
       </w:pPr>
       <w:r>
         <w:t xml:space="preserve">•  </w:t>
@@ -5542,6 +5845,7 @@
       <w:pPr>
         <w:spacing w:after="80"/>
         <w:ind w:left="432" w:hanging="432"/>
+        <w:jc w:val="both"/>
       </w:pPr>
       <w:r>
         <w:t xml:space="preserve">•  </w:t>
@@ -5565,6 +5869,7 @@
       <w:pPr>
         <w:spacing w:after="80"/>
         <w:ind w:left="432" w:hanging="432"/>
+        <w:jc w:val="both"/>
       </w:pPr>
       <w:r>
         <w:t xml:space="preserve">•  </w:t>
@@ -5588,6 +5893,7 @@
       <w:pPr>
         <w:spacing w:after="80"/>
         <w:ind w:left="432" w:hanging="432"/>
+        <w:jc w:val="both"/>
       </w:pPr>
       <w:r>
         <w:t xml:space="preserve">•  </w:t>
@@ -5611,6 +5917,7 @@
       <w:pPr>
         <w:spacing w:after="80"/>
         <w:ind w:left="432" w:hanging="432"/>
+        <w:jc w:val="both"/>
       </w:pPr>
       <w:r>
         <w:t xml:space="preserve">•  </w:t>
@@ -5643,6 +5950,9 @@
       </w:r>
     </w:p>
     <w:p>
+      <w:pPr>
+        <w:jc w:val="both"/>
+      </w:pPr>
       <w:r>
         <w:rPr>
           <w:b w:val="0"/>
@@ -5655,6 +5965,7 @@
       <w:pPr>
         <w:spacing w:after="80"/>
         <w:ind w:left="432" w:hanging="432"/>
+        <w:jc w:val="both"/>
       </w:pPr>
       <w:r>
         <w:t xml:space="preserve">1. </w:t>
@@ -5667,6 +5978,7 @@
       <w:pPr>
         <w:spacing w:after="80"/>
         <w:ind w:left="432" w:hanging="432"/>
+        <w:jc w:val="both"/>
       </w:pPr>
       <w:r>
         <w:t xml:space="preserve">2. </w:t>
@@ -5679,6 +5991,7 @@
       <w:pPr>
         <w:spacing w:after="80"/>
         <w:ind w:left="432" w:hanging="432"/>
+        <w:jc w:val="both"/>
       </w:pPr>
       <w:r>
         <w:t xml:space="preserve">3. </w:t>
@@ -5691,6 +6004,7 @@
       <w:pPr>
         <w:spacing w:after="80"/>
         <w:ind w:left="432" w:hanging="432"/>
+        <w:jc w:val="both"/>
       </w:pPr>
       <w:r>
         <w:t xml:space="preserve">4. </w:t>
@@ -5703,6 +6017,7 @@
       <w:pPr>
         <w:spacing w:after="80"/>
         <w:ind w:left="432" w:hanging="432"/>
+        <w:jc w:val="both"/>
       </w:pPr>
       <w:r>
         <w:t xml:space="preserve">5. </w:t>
@@ -5715,6 +6030,7 @@
       <w:pPr>
         <w:spacing w:after="80"/>
         <w:ind w:left="432" w:hanging="432"/>
+        <w:jc w:val="both"/>
       </w:pPr>
       <w:r>
         <w:t xml:space="preserve">6. </w:t>
@@ -5724,6 +6040,9 @@
       </w:r>
     </w:p>
     <w:p>
+      <w:pPr>
+        <w:jc w:val="both"/>
+      </w:pPr>
       <w:r>
         <w:rPr>
           <w:b w:val="0"/>
@@ -6083,14 +6402,18 @@
               <w:rPr>
                 <w:sz w:val="19"/>
               </w:rPr>
-              <w:t>O coletor tenta buscar configuração dinâmica num serviço do ONAP que não existe nesta implantação e recai na configuração estática montada. Ocorre também na implantação oficial e é inofensivo.</w:t>
+              <w:t>O coletor tenta buscar configuração dinâmica num serviço do ONAP que não existe nesta implementação e recai na configuração estática montada. Ocorre também na implementação oficial e é inofensivo.</w:t>
             </w:r>
           </w:p>
         </w:tc>
       </w:tr>
     </w:tbl>
     <w:p/>
-    <w:p/>
+    <w:p>
+      <w:pPr>
+        <w:jc w:val="both"/>
+      </w:pPr>
+    </w:p>
     <w:p>
       <w:pPr>
         <w:pStyle w:val="Heading1"/>
@@ -6107,6 +6430,7 @@
       <w:pPr>
         <w:spacing w:after="80"/>
         <w:ind w:left="432" w:hanging="432"/>
+        <w:jc w:val="both"/>
       </w:pPr>
       <w:r>
         <w:t xml:space="preserve">•  </w:t>
@@ -6130,6 +6454,7 @@
       <w:pPr>
         <w:spacing w:after="80"/>
         <w:ind w:left="432" w:hanging="432"/>
+        <w:jc w:val="both"/>
       </w:pPr>
       <w:r>
         <w:t xml:space="preserve">•  </w:t>
@@ -6153,6 +6478,7 @@
       <w:pPr>
         <w:spacing w:after="80"/>
         <w:ind w:left="432" w:hanging="432"/>
+        <w:jc w:val="both"/>
       </w:pPr>
       <w:r>
         <w:t xml:space="preserve">•  </w:t>
@@ -6176,6 +6502,7 @@
       <w:pPr>
         <w:spacing w:after="80"/>
         <w:ind w:left="432" w:hanging="432"/>
+        <w:jc w:val="both"/>
       </w:pPr>
       <w:r>
         <w:t xml:space="preserve">•  </w:t>
@@ -6199,6 +6526,7 @@
       <w:pPr>
         <w:spacing w:after="80"/>
         <w:ind w:left="432" w:hanging="432"/>
+        <w:jc w:val="both"/>
       </w:pPr>
       <w:r>
         <w:t xml:space="preserve">•  </w:t>
@@ -6215,10 +6543,14 @@
           <w:b w:val="0"/>
           <w:i w:val="0"/>
         </w:rPr>
-        <w:t xml:space="preserve"> A implantação roda sem TLS e sem OIDC, por opção de escopo. Uma implantação de produção reincorporaria o gateway e o servidor de identidade que foram removidos.</w:t>
-      </w:r>
-    </w:p>
-    <w:p/>
+        <w:t xml:space="preserve"> A implementação roda sem TLS e sem OIDC, por opção de escopo. Uma implementação de produção reincorporaria o gateway e o servidor de identidade que foram removidos.</w:t>
+      </w:r>
+    </w:p>
+    <w:p>
+      <w:pPr>
+        <w:jc w:val="both"/>
+      </w:pPr>
+    </w:p>
     <w:p>
       <w:pPr>
         <w:pStyle w:val="Heading1"/>
@@ -6232,15 +6564,21 @@
       </w:r>
     </w:p>
     <w:p>
-      <w:r>
-        <w:rPr>
-          <w:b w:val="0"/>
-          <w:i w:val="0"/>
-        </w:rPr>
-        <w:t>A ferramenta selecionada na Parte 1 foi implantada e utilizada para provisionar, gerenciar e acompanhar uma pilha Open RAN, cumprindo o objetivo da Parte 2. Os sete itens do objeto de estudo foram exercitados sobre componentes oficiais da O-RAN Software Community, com evidência de execução para cada um.</w:t>
-      </w:r>
-    </w:p>
-    <w:p>
+      <w:pPr>
+        <w:jc w:val="both"/>
+      </w:pPr>
+      <w:r>
+        <w:rPr>
+          <w:b w:val="0"/>
+          <w:i w:val="0"/>
+        </w:rPr>
+        <w:t>A ferramenta selecionada na Parte 1 foi implementada e utilizada para provisionar, gerenciar e acompanhar uma pilha Open RAN, cumprindo o objetivo da Parte 2. Os sete itens do objeto de estudo foram exercitados sobre componentes oficiais da O-RAN Software Community, com evidência de execução para cada um.</w:t>
+      </w:r>
+    </w:p>
+    <w:p>
+      <w:pPr>
+        <w:jc w:val="both"/>
+      </w:pPr>
       <w:r>
         <w:rPr>
           <w:b w:val="0"/>
@@ -6250,6 +6588,9 @@
       </w:r>
     </w:p>
     <w:p>
+      <w:pPr>
+        <w:jc w:val="both"/>
+      </w:pPr>
       <w:r>
         <w:rPr>
           <w:b w:val="0"/>
@@ -6259,24 +6600,34 @@
       </w:r>
     </w:p>
     <w:p>
-      <w:r>
-        <w:rPr>
-          <w:b w:val="0"/>
-          <w:i w:val="0"/>
-        </w:rPr>
-        <w:t>A terceira é que o custo de colocar a plataforma em funcionamento está mais na integração do que nos componentes. Nenhum dos quatro problemas encontrados era um defeito funcional de um módulo: eram uma verificação de saúde apontando para um endpoint inexistente, dois mecanismos de descoberta concorrendo entre si, uma etapa opcional de um simulador com falha de memória, e imagens sem as ferramentas que suas próprias verificações presumiam. São problemas de montagem, e é neles que o tempo de uma implantação real se concentra.</w:t>
-      </w:r>
-    </w:p>
-    <w:p>
-      <w:r>
-        <w:rPr>
-          <w:b w:val="0"/>
-          <w:i w:val="0"/>
-        </w:rPr>
-        <w:t>O resultado está publicado com tudo o que é necessário para reproduzi-lo: a pilha completa, o portal de operação, os scripts de verificação e este relatório.</w:t>
-      </w:r>
-    </w:p>
-    <w:p/>
+      <w:pPr>
+        <w:jc w:val="both"/>
+      </w:pPr>
+      <w:r>
+        <w:rPr>
+          <w:b w:val="0"/>
+          <w:i w:val="0"/>
+        </w:rPr>
+        <w:t>A terceira é que o custo de colocar a plataforma em funcionamento está mais na integração do que nos componentes. Nenhum dos quatro problemas encontrados era um defeito funcional de um módulo: eram uma verificação de saúde apontando para um endpoint inexistente, dois mecanismos de descoberta concorrendo entre si, uma etapa opcional de um simulador com falha de memória, e imagens sem as ferramentas que suas próprias verificações presumiam. São problemas de montagem, e é neles que o tempo de uma implementação real se concentra.</w:t>
+      </w:r>
+    </w:p>
+    <w:p>
+      <w:pPr>
+        <w:jc w:val="both"/>
+      </w:pPr>
+      <w:r>
+        <w:rPr>
+          <w:b w:val="0"/>
+          <w:i w:val="0"/>
+        </w:rPr>
+        <w:t>O resultado acompanha tudo o que é necessário para reproduzi-lo: a pilha completa, o portal de operação, os scripts de verificação e este relatório.</w:t>
+      </w:r>
+    </w:p>
+    <w:p>
+      <w:pPr>
+        <w:jc w:val="both"/>
+      </w:pPr>
+    </w:p>
     <w:p>
       <w:pPr>
         <w:pStyle w:val="Heading1"/>
@@ -6290,6 +6641,9 @@
       </w:r>
     </w:p>
     <w:p>
+      <w:pPr>
+        <w:jc w:val="both"/>
+      </w:pPr>
       <w:r>
         <w:rPr>
           <w:b w:val="0"/>
@@ -6299,6 +6653,9 @@
       </w:r>
     </w:p>
     <w:p>
+      <w:pPr>
+        <w:jc w:val="both"/>
+      </w:pPr>
       <w:r>
         <w:rPr>
           <w:b w:val="0"/>
@@ -6308,6 +6665,9 @@
       </w:r>
     </w:p>
     <w:p>
+      <w:pPr>
+        <w:jc w:val="both"/>
+      </w:pPr>
       <w:r>
         <w:rPr>
           <w:b w:val="0"/>
@@ -6317,6 +6677,9 @@
       </w:r>
     </w:p>
     <w:p>
+      <w:pPr>
+        <w:jc w:val="both"/>
+      </w:pPr>
       <w:r>
         <w:rPr>
           <w:b w:val="0"/>
@@ -6326,6 +6689,9 @@
       </w:r>
     </w:p>
     <w:p>
+      <w:pPr>
+        <w:jc w:val="both"/>
+      </w:pPr>
       <w:r>
         <w:rPr>
           <w:b w:val="0"/>
@@ -6335,6 +6701,9 @@
       </w:r>
     </w:p>
     <w:p>
+      <w:pPr>
+        <w:jc w:val="both"/>
+      </w:pPr>
       <w:r>
         <w:rPr>
           <w:b w:val="0"/>
@@ -6344,6 +6713,9 @@
       </w:r>
     </w:p>
     <w:p>
+      <w:pPr>
+        <w:jc w:val="both"/>
+      </w:pPr>
       <w:r>
         <w:rPr>
           <w:b w:val="0"/>
@@ -6353,6 +6725,9 @@
       </w:r>
     </w:p>
     <w:p>
+      <w:pPr>
+        <w:jc w:val="both"/>
+      </w:pPr>
       <w:r>
         <w:rPr>
           <w:b w:val="0"/>
@@ -6362,6 +6737,9 @@
       </w:r>
     </w:p>
     <w:p>
+      <w:pPr>
+        <w:jc w:val="both"/>
+      </w:pPr>
       <w:r>
         <w:rPr>
           <w:b w:val="0"/>
@@ -6371,21 +6749,15 @@
       </w:r>
     </w:p>
     <w:p>
+      <w:pPr>
+        <w:jc w:val="both"/>
+      </w:pPr>
       <w:r>
         <w:rPr>
           <w:b w:val="0"/>
           <w:i w:val="0"/>
         </w:rPr>
         <w:t>3GPP. TS 28.552 — Management and orchestration; 5G performance measurements.</w:t>
-      </w:r>
-    </w:p>
-    <w:p>
-      <w:r>
-        <w:rPr>
-          <w:b w:val="0"/>
-          <w:i w:val="0"/>
-        </w:rPr>
-        <w:t>FAVILLA, F. B. et al. Relatório — Parte 1: pesquisa, comparação e seleção de plataforma de SMO. Especialização Open RAN / CPQD, set. 2026.</w:t>
       </w:r>
     </w:p>
     <w:sectPr>

</xml_diff>